<commit_message>
Embed mockup screenshots directly into ERPNext assignment Word document
</commit_message>
<xml_diff>
--- a/ERPNext_Evaluation_Report.docx
+++ b/ERPNext_Evaluation_Report.docx
@@ -1238,6 +1238,122 @@
       </w:pPr>
     </w:p>
     <w:p>
+      <w:pPr>
+        <w:pStyle w:val="Heading2"/>
+        <w:keepNext/>
+        <w:spacing w:before="240" w:after="120"/>
+      </w:pPr>
+      <w:r>
+        <w:rPr>
+          <w:rFonts w:ascii="Plus Jakarta Sans" w:hAnsi="Plus Jakarta Sans"/>
+          <w:b/>
+          <w:color w:val="6D4C41"/>
+          <w:sz w:val="28"/>
+        </w:rPr>
+        <w:t>Screenshots Submission (Chart of Accounts)</w:t>
+      </w:r>
+    </w:p>
+    <w:tbl>
+      <w:tblPr>
+        <w:tblW w:type="auto" w:w="0"/>
+        <w:jc w:val="center"/>
+        <w:tblLook w:firstColumn="1" w:firstRow="1" w:lastColumn="0" w:lastRow="0" w:noHBand="0" w:noVBand="1" w:val="04A0"/>
+      </w:tblPr>
+      <w:tblGrid>
+        <w:gridCol w:w="9360"/>
+      </w:tblGrid>
+      <w:tr>
+        <w:tc>
+          <w:tcPr>
+            <w:tcW w:type="dxa" w:w="9360"/>
+            <w:shd w:fill="F2F5F8"/>
+            <w:tcMar>
+              <w:top w:w="180" w:type="dxa"/>
+              <w:bottom w:w="180" w:type="dxa"/>
+              <w:left w:w="240" w:type="dxa"/>
+              <w:right w:w="240" w:type="dxa"/>
+            </w:tcMar>
+            <w:tcBorders>
+              <w:top w:val="none"/>
+              <w:left w:val="single" w:sz="24" w:space="0" w:color="15803D"/>
+              <w:bottom w:val="none"/>
+              <w:right w:val="none"/>
+            </w:tcBorders>
+          </w:tcPr>
+          <w:p>
+            <w:pPr>
+              <w:spacing w:before="80" w:after="80"/>
+            </w:pPr>
+            <w:r>
+              <w:rPr>
+                <w:rFonts w:ascii="Plus Jakarta Sans" w:hAnsi="Plus Jakarta Sans"/>
+                <w:b/>
+                <w:color w:val="15803D"/>
+                <w:sz w:val="22"/>
+              </w:rPr>
+              <w:t>📷 [EMBEDDED MOCKUP: Chart of Accounts Tree Hierarchy]</w:t>
+              <w:br/>
+            </w:r>
+            <w:r>
+              <w:rPr>
+                <w:rFonts w:ascii="Plus Jakarta Sans" w:hAnsi="Plus Jakarta Sans"/>
+                <w:i/>
+                <w:color w:val="6D4C41"/>
+                <w:sz w:val="20"/>
+              </w:rPr>
+              <w:t>Instructions: Go to Accounts &gt; Chart of Accounts. Expand the Assets and Direct Income folders to show your custom ledgers.</w:t>
+              <w:br/>
+            </w:r>
+            <w:r>
+              <w:br/>
+            </w:r>
+            <w:r>
+              <w:drawing>
+                <wp:inline xmlns:a="http://schemas.openxmlformats.org/drawingml/2006/main" xmlns:pic="http://schemas.openxmlformats.org/drawingml/2006/picture">
+                  <wp:extent cx="4754880" cy="4754880"/>
+                  <wp:docPr id="1" name="Picture 1"/>
+                  <wp:cNvGraphicFramePr>
+                    <a:graphicFrameLocks noChangeAspect="1"/>
+                  </wp:cNvGraphicFramePr>
+                  <a:graphic>
+                    <a:graphicData uri="http://schemas.openxmlformats.org/drawingml/2006/picture">
+                      <pic:pic>
+                        <pic:nvPicPr>
+                          <pic:cNvPr id="0" name="erpnext_chart_of_accounts.png"/>
+                          <pic:cNvPicPr/>
+                        </pic:nvPicPr>
+                        <pic:blipFill>
+                          <a:blip r:embed="rId9"/>
+                          <a:stretch>
+                            <a:fillRect/>
+                          </a:stretch>
+                        </pic:blipFill>
+                        <pic:spPr>
+                          <a:xfrm>
+                            <a:off x="0" y="0"/>
+                            <a:ext cx="4754880" cy="4754880"/>
+                          </a:xfrm>
+                          <a:prstGeom prst="rect"/>
+                        </pic:spPr>
+                      </pic:pic>
+                    </a:graphicData>
+                  </a:graphic>
+                </wp:inline>
+              </w:drawing>
+            </w:r>
+            <w:r>
+              <w:br/>
+            </w:r>
+          </w:p>
+        </w:tc>
+      </w:tr>
+    </w:tbl>
+    <w:p>
+      <w:pPr>
+        <w:spacing w:after="240"/>
+      </w:pPr>
+    </w:p>
+    <w:p>
       <w:r>
         <w:br w:type="page"/>
       </w:r>
@@ -2048,6 +2164,7 @@
                 <w:sz w:val="20"/>
               </w:rPr>
               <w:t>Instructions: Go to Buying &gt; Request for Quotation. Open the RFQ you sent to Metro Supplies, showing the linked Supplier Quotation documents in the Connections sidebar.</w:t>
+              <w:br/>
             </w:r>
           </w:p>
         </w:tc>
@@ -2107,6 +2224,7 @@
                 <w:sz w:val="20"/>
               </w:rPr>
               <w:t>Instructions: Go to Buying &gt; Purchase Order. Capture your submitted PO details for Metro Supplies, showing the status as 'To Receive and Bill'.</w:t>
+              <w:br/>
             </w:r>
           </w:p>
         </w:tc>
@@ -2166,6 +2284,7 @@
                 <w:sz w:val="20"/>
               </w:rPr>
               <w:t>Instructions: Go to Stock &gt; Stock Ledger. Filter by your Purchase Receipt. Capture the ledger showing Laptops (+6) and Wireless Mice (+12) added to Raw Material Store.</w:t>
+              <w:br/>
             </w:r>
           </w:p>
         </w:tc>
@@ -2214,7 +2333,7 @@
                 <w:color w:val="15803D"/>
                 <w:sz w:val="22"/>
               </w:rPr>
-              <w:t>📷 [INSERT SCREENSHOT: Purchase Invoice Impact on General Ledger]</w:t>
+              <w:t>📷 [EMBEDDED MOCKUP: Purchase Invoice Impact on General Ledger]</w:t>
               <w:br/>
             </w:r>
             <w:r>
@@ -2225,6 +2344,47 @@
                 <w:sz w:val="20"/>
               </w:rPr>
               <w:t>Instructions: Open your submitted Purchase Invoice, click View &gt; Ledger in the top-right corner, and screenshot the double-entry accounting ledger table.</w:t>
+              <w:br/>
+            </w:r>
+            <w:r>
+              <w:br/>
+            </w:r>
+            <w:r>
+              <w:drawing>
+                <wp:inline xmlns:a="http://schemas.openxmlformats.org/drawingml/2006/main" xmlns:pic="http://schemas.openxmlformats.org/drawingml/2006/picture">
+                  <wp:extent cx="4754880" cy="4754880"/>
+                  <wp:docPr id="2" name="Picture 2"/>
+                  <wp:cNvGraphicFramePr>
+                    <a:graphicFrameLocks noChangeAspect="1"/>
+                  </wp:cNvGraphicFramePr>
+                  <a:graphic>
+                    <a:graphicData uri="http://schemas.openxmlformats.org/drawingml/2006/picture">
+                      <pic:pic>
+                        <pic:nvPicPr>
+                          <pic:cNvPr id="0" name="erpnext_purchase_ledger.png"/>
+                          <pic:cNvPicPr/>
+                        </pic:nvPicPr>
+                        <pic:blipFill>
+                          <a:blip r:embed="rId10"/>
+                          <a:stretch>
+                            <a:fillRect/>
+                          </a:stretch>
+                        </pic:blipFill>
+                        <pic:spPr>
+                          <a:xfrm>
+                            <a:off x="0" y="0"/>
+                            <a:ext cx="4754880" cy="4754880"/>
+                          </a:xfrm>
+                          <a:prstGeom prst="rect"/>
+                        </pic:spPr>
+                      </pic:pic>
+                    </a:graphicData>
+                  </a:graphic>
+                </wp:inline>
+              </w:drawing>
+            </w:r>
+            <w:r>
+              <w:br/>
             </w:r>
           </w:p>
         </w:tc>
@@ -3032,6 +3192,7 @@
                 <w:sz w:val="20"/>
               </w:rPr>
               <w:t>Instructions: Go to Selling &gt; Quotation. Open the quotation drafted for Alpha Retail Pvt. Ltd. showing items and total amount before discount ($117,600).</w:t>
+              <w:br/>
             </w:r>
           </w:p>
         </w:tc>
@@ -3091,6 +3252,7 @@
                 <w:sz w:val="20"/>
               </w:rPr>
               <w:t>Instructions: Go to Selling &gt; Sales Order. Open the submitted sales order showing the applied 5% discount and Net Grand Total ($111,720).</w:t>
+              <w:br/>
             </w:r>
           </w:p>
         </w:tc>
@@ -3150,6 +3312,7 @@
                 <w:sz w:val="20"/>
               </w:rPr>
               <w:t>Instructions: Go to Stock &gt; Stock Ledger. Filter by your Delivery Note. Verify negative entries (outwards) for 2 Laptops and 3 Mice from Raw Material Store.</w:t>
+              <w:br/>
             </w:r>
           </w:p>
         </w:tc>
@@ -3209,6 +3372,7 @@
                 <w:sz w:val="20"/>
               </w:rPr>
               <w:t>Instructions: Go to Accounts &gt; Accounts Receivable. Filter by Customer: Alpha Retail Pvt. Ltd. Take a screenshot showing the outstanding balance of $111,720.</w:t>
+              <w:br/>
             </w:r>
           </w:p>
         </w:tc>
@@ -3268,6 +3432,7 @@
                 <w:sz w:val="20"/>
               </w:rPr>
               <w:t>Instructions: Open the submitted Sales Invoice, click View &gt; Ledger, and screenshot the double-entry accounting ledger table.</w:t>
+              <w:br/>
             </w:r>
           </w:p>
         </w:tc>
@@ -4022,6 +4187,7 @@
                 <w:sz w:val="20"/>
               </w:rPr>
               <w:t>Instructions: Go to Stock &gt; Item. Take a screenshot of the item list showing the Bluetooth Speaker and its four configured raw materials.</w:t>
+              <w:br/>
             </w:r>
           </w:p>
         </w:tc>
@@ -4070,7 +4236,7 @@
                 <w:color w:val="15803D"/>
                 <w:sz w:val="22"/>
               </w:rPr>
-              <w:t>📷 [INSERT SCREENSHOT: Bill of Materials (BOM)]</w:t>
+              <w:t>📷 [EMBEDDED MOCKUP: Bill of Materials (BOM)]</w:t>
               <w:br/>
             </w:r>
             <w:r>
@@ -4081,6 +4247,47 @@
                 <w:sz w:val="20"/>
               </w:rPr>
               <w:t>Instructions: Go to Manufacturing &gt; Bill of Materials. Open BOM-TPL-BS-001 showing the raw materials table and consumption ratios.</w:t>
+              <w:br/>
+            </w:r>
+            <w:r>
+              <w:br/>
+            </w:r>
+            <w:r>
+              <w:drawing>
+                <wp:inline xmlns:a="http://schemas.openxmlformats.org/drawingml/2006/main" xmlns:pic="http://schemas.openxmlformats.org/drawingml/2006/picture">
+                  <wp:extent cx="4754880" cy="4754880"/>
+                  <wp:docPr id="3" name="Picture 3"/>
+                  <wp:cNvGraphicFramePr>
+                    <a:graphicFrameLocks noChangeAspect="1"/>
+                  </wp:cNvGraphicFramePr>
+                  <a:graphic>
+                    <a:graphicData uri="http://schemas.openxmlformats.org/drawingml/2006/picture">
+                      <pic:pic>
+                        <pic:nvPicPr>
+                          <pic:cNvPr id="0" name="erpnext_manufacturing.png"/>
+                          <pic:cNvPicPr/>
+                        </pic:nvPicPr>
+                        <pic:blipFill>
+                          <a:blip r:embed="rId11"/>
+                          <a:stretch>
+                            <a:fillRect/>
+                          </a:stretch>
+                        </pic:blipFill>
+                        <pic:spPr>
+                          <a:xfrm>
+                            <a:off x="0" y="0"/>
+                            <a:ext cx="4754880" cy="4754880"/>
+                          </a:xfrm>
+                          <a:prstGeom prst="rect"/>
+                        </pic:spPr>
+                      </pic:pic>
+                    </a:graphicData>
+                  </a:graphic>
+                </wp:inline>
+              </w:drawing>
+            </w:r>
+            <w:r>
+              <w:br/>
             </w:r>
           </w:p>
         </w:tc>
@@ -4140,6 +4347,7 @@
                 <w:sz w:val="20"/>
               </w:rPr>
               <w:t>Instructions: Go to Manufacturing &gt; Work Order. Screenshot the Work Order for 10 Bluetooth Speakers showing the status as 'Completed'.</w:t>
+              <w:br/>
             </w:r>
           </w:p>
         </w:tc>
@@ -4199,6 +4407,7 @@
                 <w:sz w:val="20"/>
               </w:rPr>
               <w:t>Instructions: Go to Stock &gt; Stock Entry. Open the Stock Entry of type 'Manufacture' showing raw materials consumed from WIP and speakers received in Finished Goods.</w:t>
+              <w:br/>
             </w:r>
           </w:p>
         </w:tc>
@@ -4258,6 +4467,7 @@
                 <w:sz w:val="20"/>
               </w:rPr>
               <w:t>Instructions: Go to Stock &gt; Stock Ledger. Filter by your Manufacture Stock Entry, showing negative adjustments for raw materials in WIP and positive adjustment (+10) in Finished Goods.</w:t>
+              <w:br/>
             </w:r>
           </w:p>
         </w:tc>

</xml_diff>